<commit_message>
Resolved table formatting issues, and tensing issues.
</commit_message>
<xml_diff>
--- a/_out/mdl/2024/MDL-Scott_County-416005892-2024.docx
+++ b/_out/mdl/2024/MDL-Scott_County-416005892-2024.docx
@@ -33,7 +33,7 @@
           <w:smallCaps w:val="0"/>
           <w:sz w:val="24"/>
         </w:rPr>
-        <w:t>January 20, 2026</w:t>
+        <w:t>March 02, 2026</w:t>
       </w:r>
     </w:p>
     <w:p>
@@ -198,7 +198,7 @@
           <w:smallCaps w:val="0"/>
           <w:sz w:val="24"/>
         </w:rPr>
-        <w:t>Subject: U.S. Department of the Treasury’s Management Decision Letter (MDL) for Single Audit Report for the period ending on December 31, 2024</w:t>
+        <w:t>Subject: U.S. Department of the Treasury’s Management Decision Letter (MDL) for Single Audit Report for the period ending on June 30, 2024</w:t>
       </w:r>
     </w:p>
     <w:p>
@@ -281,7 +281,7 @@
           <w:b/>
           <w:sz w:val="24"/>
         </w:rPr>
-        <w:t>December 31, 2024</w:t>
+        <w:t>June 30, 2024</w:t>
       </w:r>
       <w:r>
         <w:rPr>
@@ -574,7 +574,7 @@
           </w:tcPr>
           <w:p>
             <w:pPr>
-              <w:spacing w:before="76"/>
+              <w:spacing w:before="76" w:after="0"/>
               <w:jc w:val="center"/>
             </w:pPr>
             <w:r>
@@ -582,11 +582,41 @@
                 <w:sz w:val="24"/>
               </w:rPr>
               <w:t>Questioned Cost:</w:t>
-              <w:br/>
+            </w:r>
+          </w:p>
+          <w:p>
+            <w:pPr>
+              <w:spacing w:before="76" w:after="0"/>
+              <w:jc w:val="center"/>
+            </w:pPr>
+            <w:r>
+              <w:rPr>
+                <w:sz w:val="24"/>
+              </w:rPr>
               <w:t>None</w:t>
-              <w:br/>
+            </w:r>
+          </w:p>
+          <w:p>
+            <w:pPr>
+              <w:spacing w:before="76" w:after="0"/>
+              <w:jc w:val="center"/>
+            </w:pPr>
+            <w:r>
+              <w:rPr>
+                <w:sz w:val="24"/>
+              </w:rPr>
               <w:t>Disallowed Cost:</w:t>
-              <w:br/>
+            </w:r>
+          </w:p>
+          <w:p>
+            <w:pPr>
+              <w:spacing w:before="76" w:after="240"/>
+              <w:jc w:val="center"/>
+            </w:pPr>
+            <w:r>
+              <w:rPr>
+                <w:sz w:val="24"/>
+              </w:rPr>
               <w:t>None</w:t>
             </w:r>
           </w:p>

</xml_diff>

<commit_message>
Multiple findings fixes: table spacing, plural tense grammar, correct ALNs being pulled
</commit_message>
<xml_diff>
--- a/_out/mdl/2024/MDL-Scott_County-416005892-2024.docx
+++ b/_out/mdl/2024/MDL-Scott_County-416005892-2024.docx
@@ -33,7 +33,7 @@
           <w:smallCaps w:val="0"/>
           <w:sz w:val="24"/>
         </w:rPr>
-        <w:t>March 02, 2026</w:t>
+        <w:t>March 03, 2026</w:t>
       </w:r>
     </w:p>
     <w:p>
@@ -249,19 +249,19 @@
       </w:pPr>
       <w:commentRangeStart w:id="16"/>
       <w:commentRangeEnd w:id="16"/>
-      <w:commentRangeStart w:id="17"/>
-      <w:commentRangeEnd w:id="17"/>
-      <w:bookmarkStart w:id="18" w:name="_Hlk154663119"/>
+      <w:bookmarkStart w:id="17" w:name="_Hlk154663119"/>
+      <w:proofErr w:type="gramStart"/>
+      <w:proofErr w:type="gramEnd"/>
+      <w:commentRangeStart w:id="18"/>
       <w:commentRangeStart w:id="19"/>
-      <w:commentRangeStart w:id="20"/>
+      <w:commentRangeEnd w:id="18"/>
       <w:commentRangeEnd w:id="19"/>
-      <w:commentRangeEnd w:id="20"/>
-      <w:bookmarkEnd w:id="18"/>
-      <w:r>
-        <w:rPr>
-          <w:sz w:val="24"/>
-        </w:rPr>
-        <w:t xml:space="preserve">Treasury has reviewed the single audit report for </w:t>
+      <w:bookmarkEnd w:id="17"/>
+      <w:r>
+        <w:rPr>
+          <w:sz w:val="24"/>
+        </w:rPr>
+        <w:t xml:space="preserve">Treasury has reviewed the single audit report for the </w:t>
       </w:r>
       <w:r>
         <w:rPr>
@@ -311,12 +311,12 @@
           <w:szCs w:val="24"/>
         </w:rPr>
       </w:pPr>
+      <w:commentRangeStart w:id="20"/>
       <w:commentRangeStart w:id="21"/>
       <w:commentRangeStart w:id="22"/>
-      <w:commentRangeStart w:id="23"/>
+      <w:commentRangeEnd w:id="20"/>
       <w:commentRangeEnd w:id="21"/>
       <w:commentRangeEnd w:id="22"/>
-      <w:commentRangeEnd w:id="23"/>
       <w:r>
         <w:rPr>
           <w:b/>
@@ -652,7 +652,7 @@
           <w:szCs w:val="24"/>
         </w:rPr>
       </w:pPr>
-      <w:bookmarkStart w:id="24" w:name="_Hlk154663631"/>
+      <w:bookmarkStart w:id="23" w:name="_Hlk154663631"/>
     </w:p>
     <w:p>
       <w:pPr>
@@ -664,8 +664,8 @@
           <w:szCs w:val="24"/>
         </w:rPr>
       </w:pPr>
-      <w:commentRangeStart w:id="25"/>
-      <w:bookmarkStart w:id="26" w:name="_Hlk172811021"/>
+      <w:commentRangeStart w:id="24"/>
+      <w:bookmarkStart w:id="25" w:name="_Hlk172811021"/>
       <w:r>
         <w:rPr>
           <w:sz w:val="24"/>
@@ -673,7 +673,7 @@
         <w:t xml:space="preserve">The audit finding is sustained as the identified issue violates the terms and conditions of the above-referenced award. The CAP, if implemented, is responsive to the audit finding, addresses the cause of the audit finding and should be completed in accordance with the action date indicated in the single audit report. </w:t>
       </w:r>
     </w:p>
-    <w:bookmarkEnd w:id="26"/>
+    <w:bookmarkEnd w:id="25"/>
     <w:p>
       <w:pPr>
         <w:pStyle w:val="BodyText"/>
@@ -696,9 +696,11 @@
           <w:szCs w:val="24"/>
         </w:rPr>
       </w:pPr>
-      <w:bookmarkStart w:id="27" w:name="_Hlk154663714"/>
-      <w:bookmarkEnd w:id="24"/>
-      <w:commentRangeEnd w:id="25"/>
+      <w:proofErr w:type="gramStart"/>
+      <w:proofErr w:type="gramEnd"/>
+      <w:bookmarkStart w:id="26" w:name="_Hlk154663714"/>
+      <w:bookmarkEnd w:id="23"/>
+      <w:commentRangeEnd w:id="24"/>
       <w:r>
         <w:rPr>
           <w:sz w:val="24"/>
@@ -726,15 +728,19 @@
           <w:szCs w:val="24"/>
         </w:rPr>
       </w:pPr>
-      <w:commentRangeStart w:id="28"/>
-      <w:commentRangeEnd w:id="28"/>
+      <w:commentRangeStart w:id="27"/>
+      <w:commentRangeEnd w:id="27"/>
+      <w:proofErr w:type="gramStart"/>
+      <w:proofErr w:type="gramEnd"/>
       <w:proofErr w:type="spellStart"/>
       <w:proofErr w:type="spellEnd"/>
-      <w:r>
-        <w:rPr>
-          <w:sz w:val="24"/>
-        </w:rPr>
-        <w:t xml:space="preserve">Scott County may appeal Treasury’s decision for the audit finding listed above. A written appeal must be submitted within 30 calendar days of the date of this management decision letter to Treasury via email at </w:t>
+      <w:proofErr w:type="gramStart"/>
+      <w:proofErr w:type="gramEnd"/>
+      <w:r>
+        <w:rPr>
+          <w:sz w:val="24"/>
+        </w:rPr>
+        <w:t xml:space="preserve">The Scott County may appeal Treasury’s decision for the audit finding listed above. A written appeal must be submitted within 30 calendar days of the date of this management decision letter to Treasury via email at </w:t>
       </w:r>
       <w:hyperlink r:id="rId24">
         <w:r>
@@ -764,7 +770,7 @@
           <w:szCs w:val="24"/>
         </w:rPr>
       </w:pPr>
-      <w:bookmarkStart w:id="29" w:name="_Hlk172811103"/>
+      <w:bookmarkStart w:id="28" w:name="_Hlk172811103"/>
     </w:p>
     <w:p>
       <w:pPr>
@@ -776,8 +782,12 @@
           <w:szCs w:val="24"/>
         </w:rPr>
       </w:pPr>
+      <w:proofErr w:type="gramStart"/>
+      <w:proofErr w:type="gramEnd"/>
       <w:proofErr w:type="spellStart"/>
       <w:proofErr w:type="spellEnd"/>
+      <w:proofErr w:type="gramStart"/>
+      <w:proofErr w:type="gramEnd"/>
       <w:r>
         <w:rPr>
           <w:sz w:val="24"/>
@@ -802,7 +812,7 @@
         <w:t>. Thank you.</w:t>
       </w:r>
     </w:p>
-    <w:bookmarkEnd w:id="29"/>
+    <w:bookmarkEnd w:id="28"/>
     <w:p>
       <w:pPr>
         <w:pStyle w:val="BodyText"/>
@@ -1066,7 +1076,7 @@
         <w:t xml:space="preserve">Treasury </w:t>
       </w:r>
     </w:p>
-    <w:bookmarkEnd w:id="27"/>
+    <w:bookmarkEnd w:id="26"/>
     <w:p>
       <w:pPr>
         <w:pStyle w:val="BodyText"/>
@@ -1352,7 +1362,7 @@
       </w:r>
     </w:p>
   </w:comment>
-  <w:comment w:id="16" w:author="Anthony D'Alessandro" w:date="2025-09-08T11:19:00Z" w:initials="AD">
+  <w:comment w:id="16" w:author="Anthony D'Alessandro" w:date="2025-09-08T11:20:00Z" w:initials="AD">
     <w:p>
       <w:pPr>
         <w:pStyle w:val="CommentText"/>
@@ -1364,11 +1374,17 @@
         <w:annotationRef/>
       </w:r>
       <w:r>
-        <w:t>Must add “The” before recipient name</w:t>
+        <w:t>Need full name as written in SF-SAC [auditee_name] “</w:t>
+      </w:r>
+      <w:r>
+        <w:rPr>
+          <w:color w:val="000000"/>
+        </w:rPr>
+        <w:t>CITY OF ANN ARBOR, MICHIGAN”</w:t>
       </w:r>
     </w:p>
   </w:comment>
-  <w:comment w:id="17" w:author="Anthony D'Alessandro" w:date="2025-09-08T11:20:00Z" w:initials="AD">
+  <w:comment w:id="18" w:author="Anthony D'Alessandro" w:date="2025-09-08T11:30:00Z" w:initials="AD">
     <w:p>
       <w:pPr>
         <w:pStyle w:val="CommentText"/>
@@ -1380,17 +1396,11 @@
         <w:annotationRef/>
       </w:r>
       <w:r>
-        <w:t>Need full name as written in SF-SAC [auditee_name] “</w:t>
-      </w:r>
-      <w:r>
-        <w:rPr>
-          <w:color w:val="000000"/>
-        </w:rPr>
-        <w:t>CITY OF ANN ARBOR, MICHIGAN”</w:t>
+        <w:t>Add S if plural, remove if singular finding</w:t>
       </w:r>
     </w:p>
   </w:comment>
-  <w:comment w:id="19" w:author="Anthony D'Alessandro" w:date="2025-09-08T11:30:00Z" w:initials="AD">
+  <w:comment w:id="19" w:author="Anthony D'Alessandro" w:date="2025-09-08T13:29:00Z" w:initials="AD">
     <w:p>
       <w:pPr>
         <w:pStyle w:val="CommentText"/>
@@ -1402,27 +1412,11 @@
         <w:annotationRef/>
       </w:r>
       <w:r>
-        <w:t>Add S if plural, remove if singular finding</w:t>
+        <w:t>No plural in this example</w:t>
       </w:r>
     </w:p>
   </w:comment>
-  <w:comment w:id="20" w:author="Anthony D'Alessandro" w:date="2025-09-08T13:29:00Z" w:initials="AD">
-    <w:p>
-      <w:pPr>
-        <w:pStyle w:val="CommentText"/>
-      </w:pPr>
-      <w:r>
-        <w:rPr>
-          <w:rStyle w:val="CommentReference"/>
-        </w:rPr>
-        <w:annotationRef/>
-      </w:r>
-      <w:r>
-        <w:t>No plural in this example</w:t>
-      </w:r>
-    </w:p>
-  </w:comment>
-  <w:comment w:id="21" w:author="Jones, Jasmine" w:date="2024-07-26T14:49:00Z" w:initials="JJ">
+  <w:comment w:id="20" w:author="Jones, Jasmine" w:date="2024-07-26T14:49:00Z" w:initials="JJ">
     <w:p>
       <w:pPr>
         <w:pStyle w:val="CommentText"/>
@@ -1517,7 +1511,7 @@
       </w:r>
     </w:p>
   </w:comment>
-  <w:comment w:id="22" w:author="Anthony D'Alessandro" w:date="2025-09-08T14:22:00Z" w:initials="AD">
+  <w:comment w:id="21" w:author="Anthony D'Alessandro" w:date="2025-09-08T14:22:00Z" w:initials="AD">
     <w:p>
       <w:pPr>
         <w:pStyle w:val="CommentText"/>
@@ -1533,7 +1527,7 @@
       </w:r>
     </w:p>
   </w:comment>
-  <w:comment w:id="23" w:author="Anthony D'Alessandro" w:date="2025-09-08T15:17:00Z" w:initials="AD">
+  <w:comment w:id="22" w:author="Anthony D'Alessandro" w:date="2025-09-08T15:17:00Z" w:initials="AD">
     <w:p>
       <w:pPr>
         <w:pStyle w:val="CommentText"/>
@@ -1549,7 +1543,7 @@
       </w:r>
     </w:p>
   </w:comment>
-  <w:comment w:id="25" w:author="Anthony D'Alessandro" w:date="2025-09-08T14:18:00Z" w:initials="AD">
+  <w:comment w:id="24" w:author="Anthony D'Alessandro" w:date="2025-09-08T14:18:00Z" w:initials="AD">
     <w:p>
       <w:pPr>
         <w:pStyle w:val="CommentText"/>
@@ -1565,7 +1559,7 @@
       </w:r>
     </w:p>
   </w:comment>
-  <w:comment w:id="28" w:author="Anthony D'Alessandro" w:date="2025-09-08T14:20:00Z" w:initials="AD">
+  <w:comment w:id="27" w:author="Anthony D'Alessandro" w:date="2025-09-08T14:20:00Z" w:initials="AD">
     <w:p>
       <w:pPr>
         <w:pStyle w:val="CommentText"/>
@@ -1607,7 +1601,6 @@
   <w15:commentEx w15:paraId="106C798F" w15:done="0"/>
   <w15:commentEx w15:paraId="39797E7D" w15:paraIdParent="106C798F" w15:done="0"/>
   <w15:commentEx w15:paraId="02B6DC6A" w15:paraIdParent="106C798F" w15:done="0"/>
-  <w15:commentEx w15:paraId="1E8E3193" w15:done="0"/>
   <w15:commentEx w15:paraId="0AA7958F" w15:done="0"/>
   <w15:commentEx w15:paraId="43DE5A9E" w15:done="0"/>
   <w15:commentEx w15:paraId="16C20D1E" w15:paraIdParent="43DE5A9E" w15:done="0"/>
@@ -1636,7 +1629,6 @@
   <w16cex:commentExtensible w16cex:durableId="70C9BCE0" w16cex:dateUtc="2025-09-08T15:12:00Z"/>
   <w16cex:commentExtensible w16cex:durableId="7048A7A0" w16cex:dateUtc="2025-09-08T15:17:00Z"/>
   <w16cex:commentExtensible w16cex:durableId="1696BE24" w16cex:dateUtc="2025-09-08T15:21:00Z"/>
-  <w16cex:commentExtensible w16cex:durableId="405864F6" w16cex:dateUtc="2025-09-08T15:19:00Z"/>
   <w16cex:commentExtensible w16cex:durableId="1BFAB22C" w16cex:dateUtc="2025-09-08T15:20:00Z"/>
   <w16cex:commentExtensible w16cex:durableId="3EC27938" w16cex:dateUtc="2025-09-08T15:30:00Z"/>
   <w16cex:commentExtensible w16cex:durableId="6A1394DD" w16cex:dateUtc="2025-09-08T17:29:00Z"/>
@@ -1665,7 +1657,6 @@
   <w16cid:commentId w16cid:paraId="106C798F" w16cid:durableId="70C9BCE0"/>
   <w16cid:commentId w16cid:paraId="39797E7D" w16cid:durableId="7048A7A0"/>
   <w16cid:commentId w16cid:paraId="02B6DC6A" w16cid:durableId="1696BE24"/>
-  <w16cid:commentId w16cid:paraId="1E8E3193" w16cid:durableId="405864F6"/>
   <w16cid:commentId w16cid:paraId="0AA7958F" w16cid:durableId="1BFAB22C"/>
   <w16cid:commentId w16cid:paraId="43DE5A9E" w16cid:durableId="3EC27938"/>
   <w16cid:commentId w16cid:paraId="16C20D1E" w16cid:durableId="6A1394DD"/>
@@ -1860,7 +1851,7 @@
           <v:imagedata r:id="rId1" o:title=""/>
           <w10:wrap anchorx="page" anchory="page"/>
         </v:shape>
-        <o:OLEObject Type="Embed" ProgID="Word.Picture.8" ShapeID="_x0000_s1026" DrawAspect="Content" ObjectID="_1829977278" r:id="rId2"/>
+        <o:OLEObject Type="Embed" ProgID="Word.Picture.8" ShapeID="_x0000_s1026" DrawAspect="Content" ObjectID="_1834034368" r:id="rId2"/>
       </w:object>
     </w:r>
     <w:r>

</xml_diff>